<commit_message>
changed progress report for term 3
</commit_message>
<xml_diff>
--- a/progress_report_template.docx
+++ b/progress_report_template.docx
@@ -79,7 +79,7 @@
           <w:u w:val="single"/>
           <w:rtl w:val="0"/>
         </w:rPr>
-        <w:t xml:space="preserve">CS0027</w:t>
+        <w:t xml:space="preserve">CS0033</w:t>
       </w:r>
       <w:r>
         <w:rPr>
@@ -659,7 +659,7 @@
                 <w:szCs w:val="20"/>
                 <w:rtl w:val="0"/>
               </w:rPr>
-              <w:t xml:space="preserve"> ✔ </w:t>
+              <w:t xml:space="preserve"> </w:t>
             </w:r>
             <w:r>
               <w:rPr>
@@ -696,7 +696,30 @@
                 <w:szCs w:val="20"/>
                 <w:rtl w:val="0"/>
               </w:rPr>
-              <w:t xml:space="preserve">     [ ] 3</w:t>
+              <w:t xml:space="preserve">     [ </w:t>
+            </w:r>
+            <w:r>
+              <w:rPr>
+                <w:rFonts w:ascii="Noto Sans Symbols" w:cs="Noto Sans Symbols" w:eastAsia="Noto Sans Symbols" w:hAnsi="Noto Sans Symbols"/>
+                <w:b w:val="1"/>
+                <w:bCs w:val="1"/>
+                <w:sz w:val="20"/>
+                <w:szCs w:val="20"/>
+                <w:rtl w:val="0"/>
+              </w:rPr>
+              <w:t xml:space="preserve">✔</w:t>
+            </w:r>
+            <w:r>
+              <w:rPr>
+                <w:rFonts w:ascii="Calibri" w:cs="Calibri" w:eastAsia="Calibri" w:hAnsi="Calibri"/>
+                <w:b w:val="1"/>
+                <w:bCs w:val="1"/>
+                <w:color w:val="000000"/>
+                <w:sz w:val="20"/>
+                <w:szCs w:val="20"/>
+                <w:rtl w:val="0"/>
+              </w:rPr>
+              <w:t xml:space="preserve"> ] 3</w:t>
             </w:r>
             <w:r>
               <w:rPr>

</xml_diff>